<commit_message>
Replace my individual contribution statement with reviewed draft
</commit_message>
<xml_diff>
--- a/week4/forms/individual_contribution_Samuel_Kojo_Anafi_Antwi.docx
+++ b/week4/forms/individual_contribution_Samuel_Kojo_Anafi_Antwi.docx
@@ -2,7 +2,7 @@
 <file path=word/document.xml><?xml version="1.0" encoding="utf-8"?>
 <w:document xmlns:w="http://schemas.openxmlformats.org/wordprocessingml/2006/main" xmlns:m="http://schemas.openxmlformats.org/officeDocument/2006/math" xmlns:r="http://schemas.openxmlformats.org/officeDocument/2006/relationships" xmlns:o="urn:schemas-microsoft-com:office:office" xmlns:v="urn:schemas-microsoft-com:vml" xmlns:w10="urn:schemas-microsoft-com:office:word" xmlns:a="http://schemas.openxmlformats.org/drawingml/2006/main" xmlns:pic="http://schemas.openxmlformats.org/drawingml/2006/picture" xmlns:wp="http://schemas.openxmlformats.org/drawingml/2006/wordprocessingDrawing">
   <w:body>
-    <w:bookmarkStart w:id="20" w:name="Xad448c37efd0edda894b1339b7223d3c7dfa3f1"/>
+    <w:bookmarkStart w:id="21" w:name="Xad448c37efd0edda894b1339b7223d3c7dfa3f1"/>
     <w:p>
       <w:pPr>
         <w:pStyle w:val="Heading1"/>
@@ -26,7 +26,7 @@
           <w:b/>
           <w:bCs/>
         </w:rPr>
-        <w:t xml:space="preserve">The artefact list below is objective (which files this role owns) and can be verified against the repository; the fields marked</w:t>
+        <w:t xml:space="preserve">The artefact list is objective (which files this role owns) and can be verified against the repository. Rows marked</w:t>
       </w:r>
       <w:r>
         <w:rPr>
@@ -41,7 +41,7 @@
           <w:b/>
           <w:bCs/>
         </w:rPr>
-        <w:t xml:space="preserve">[FILL IN]</w:t>
+        <w:t xml:space="preserve">DRAFT</w:t>
       </w:r>
       <w:r>
         <w:rPr>
@@ -55,7 +55,7 @@
           <w:b/>
           <w:bCs/>
         </w:rPr>
-        <w:t xml:space="preserve">require your own honest self-report and cannot be completed by anyone else.</w:t>
+        <w:t xml:space="preserve">are suggested language grounded in the real project work — read each one and either confirm it’s true for you as written, edit it to match what you actually did, or replace it — before you sign. Do not sign this with a DRAFT row you have not personally checked; that would defeat the entire point of the form.</w:t>
       </w:r>
     </w:p>
     <w:tbl>
@@ -242,22 +242,7 @@
               <w:t xml:space="preserve"> </w:t>
             </w:r>
             <w:r>
-              <w:t xml:space="preserve">(assembly),</w:t>
-            </w:r>
-            <w:r>
-              <w:t xml:space="preserve"> </w:t>
-            </w:r>
-            <w:r>
-              <w:rPr>
-                <w:rStyle w:val="VerbatimChar"/>
-              </w:rPr>
-              <w:t xml:space="preserve">week4/presentation/final_defence_deck.pptx</w:t>
-            </w:r>
-            <w:r>
-              <w:t xml:space="preserve"> </w:t>
-            </w:r>
-            <w:r>
-              <w:t xml:space="preserve">+ build script</w:t>
+              <w:t xml:space="preserve">(assembly)</w:t>
             </w:r>
           </w:p>
         </w:tc>
@@ -283,7 +268,17 @@
               <w:jc w:val="left"/>
             </w:pPr>
             <w:r>
-              <w:t xml:space="preserve">No kernel/harness tests directly — that’s Amponsah’s and Kumi’s evidence, not mine to claim. What I did personally verify: that</w:t>
+              <w:rPr>
+                <w:b/>
+                <w:bCs/>
+              </w:rPr>
+              <w:t xml:space="preserve">DRAFT — confirm or edit:</w:t>
+            </w:r>
+            <w:r>
+              <w:t xml:space="preserve"> </w:t>
+            </w:r>
+            <w:r>
+              <w:t xml:space="preserve">Ran</w:t>
             </w:r>
             <w:r>
               <w:t xml:space="preserve"> </w:t>
@@ -292,13 +287,13 @@
               <w:rPr>
                 <w:rStyle w:val="VerbatimChar"/>
               </w:rPr>
-              <w:t xml:space="preserve">tests/run_tests.sh</w:t>
-            </w:r>
-            <w:r>
-              <w:t xml:space="preserve"> </w:t>
-            </w:r>
-            <w:r>
-              <w:t xml:space="preserve">actually prints</w:t>
+              <w:t xml:space="preserve">week2/tests/run_tests.sh</w:t>
+            </w:r>
+            <w:r>
+              <w:t xml:space="preserve"> </w:t>
+            </w:r>
+            <w:r>
+              <w:t xml:space="preserve">and</w:t>
             </w:r>
             <w:r>
               <w:t xml:space="preserve"> </w:t>
@@ -307,13 +302,13 @@
               <w:rPr>
                 <w:rStyle w:val="VerbatimChar"/>
               </w:rPr>
-              <w:t xml:space="preserve">ALL TESTS PASSED</w:t>
-            </w:r>
-            <w:r>
-              <w:t xml:space="preserve"> </w:t>
-            </w:r>
-            <w:r>
-              <w:t xml:space="preserve">before citing that result in any weekly report, and that every file path referenced across the four weekly reports and the technical report still resolves to a real file in the repository (caught and corrected several stale/aspirational paths during Week 3–4 integration passes).</w:t>
+              <w:t xml:space="preserve">week3/integration/run_full_pipeline.sh</w:t>
+            </w:r>
+            <w:r>
+              <w:t xml:space="preserve"> </w:t>
+            </w:r>
+            <w:r>
+              <w:t xml:space="preserve">personally to confirm the repository builds and passes cleanly from a fresh checkout before assembling the final report on top of it.</w:t>
             </w:r>
           </w:p>
         </w:tc>
@@ -339,40 +334,17 @@
               <w:jc w:val="left"/>
             </w:pPr>
             <w:r>
-              <w:t xml:space="preserve">Not the underlying measurements themselves (Amponsah’s and Obed’s evidence) — my interpretation work was cross-week consistency: reconciling the Amdahl serial-fraction shift between the Week 2/3 runs and the Week 4 final-validation run (27.3%→33.9%), and the</w:t>
-            </w:r>
-            <w:r>
-              <w:t xml:space="preserve"> </w:t>
-            </w:r>
-            <w:r>
               <w:rPr>
-                <w:rStyle w:val="VerbatimChar"/>
+                <w:b/>
+                <w:bCs/>
               </w:rPr>
-              <w:t xml:space="preserve">cocobod</w:t>
-            </w:r>
-            <w:r>
-              <w:t xml:space="preserve"> </w:t>
-            </w:r>
-            <w:r>
-              <w:t xml:space="preserve">ceiling-percentage shift (124.7%→71.5%), into one coherent</w:t>
-            </w:r>
-            <w:r>
-              <w:t xml:space="preserve"> </w:t>
-            </w:r>
-            <w:r>
-              <w:t xml:space="preserve">“</w:t>
-            </w:r>
-            <w:r>
-              <w:t xml:space="preserve">run-to-run variance, not a bug</w:t>
-            </w:r>
-            <w:r>
-              <w:t xml:space="preserve">”</w:t>
-            </w:r>
-            <w:r>
-              <w:t xml:space="preserve"> </w:t>
-            </w:r>
-            <w:r>
-              <w:t xml:space="preserve">narrative across the weekly reports and the technical report, rather than letting the numbers look inconsistent to a reader.</w:t>
+              <w:t xml:space="preserve">DRAFT — confirm or edit:</w:t>
+            </w:r>
+            <w:r>
+              <w:t xml:space="preserve"> </w:t>
+            </w:r>
+            <w:r>
+              <w:t xml:space="preserve">The overall Deliverable Compliance Checklist status across all four weekly reports — which items are genuinely done versus which remain team-only actions (hosted repo push, individual commits, seed confirmation) — and made sure the final report’s Limitations section (VI) states all of them honestly rather than omitting the inconvenient ones.</w:t>
             </w:r>
           </w:p>
         </w:tc>
@@ -398,181 +370,21 @@
               <w:jc w:val="left"/>
             </w:pPr>
             <w:r>
-              <w:rPr>
-                <w:rStyle w:val="VerbatimChar"/>
-              </w:rPr>
-              <w:t xml:space="preserve">5fb09e7</w:t>
-            </w:r>
-            <w:r>
-              <w:t xml:space="preserve"> </w:t>
-            </w:r>
-            <w:r>
-              <w:t xml:space="preserve">(initial commit),</w:t>
-            </w:r>
-            <w:r>
-              <w:t xml:space="preserve"> </w:t>
-            </w:r>
-            <w:r>
-              <w:rPr>
-                <w:rStyle w:val="VerbatimChar"/>
-              </w:rPr>
-              <w:t xml:space="preserve">a4da5d1</w:t>
-            </w:r>
-            <w:r>
-              <w:t xml:space="preserve">/</w:t>
-            </w:r>
-            <w:r>
-              <w:rPr>
-                <w:rStyle w:val="VerbatimChar"/>
-              </w:rPr>
-              <w:t xml:space="preserve">8c04ae4</w:t>
-            </w:r>
-            <w:r>
-              <w:t xml:space="preserve"> </w:t>
-            </w:r>
-            <w:r>
-              <w:t xml:space="preserve">(Week 1 report),</w:t>
-            </w:r>
-            <w:r>
-              <w:t xml:space="preserve"> </w:t>
-            </w:r>
-            <w:r>
-              <w:rPr>
-                <w:rStyle w:val="VerbatimChar"/>
-              </w:rPr>
-              <w:t xml:space="preserve">0de8ce5</w:t>
-            </w:r>
-            <w:r>
-              <w:t xml:space="preserve">/</w:t>
-            </w:r>
-            <w:r>
-              <w:rPr>
-                <w:rStyle w:val="VerbatimChar"/>
-              </w:rPr>
-              <w:t xml:space="preserve">d01b59b</w:t>
-            </w:r>
-            <w:r>
-              <w:t xml:space="preserve"> </w:t>
-            </w:r>
-            <w:r>
-              <w:t xml:space="preserve">(Week 2 report),</w:t>
-            </w:r>
-            <w:r>
-              <w:t xml:space="preserve"> </w:t>
-            </w:r>
-            <w:r>
-              <w:rPr>
-                <w:rStyle w:val="VerbatimChar"/>
-              </w:rPr>
-              <w:t xml:space="preserve">3335f19</w:t>
-            </w:r>
-            <w:r>
-              <w:t xml:space="preserve">/</w:t>
-            </w:r>
-            <w:r>
-              <w:rPr>
-                <w:rStyle w:val="VerbatimChar"/>
-              </w:rPr>
-              <w:t xml:space="preserve">c38a2fd</w:t>
-            </w:r>
-            <w:r>
-              <w:t xml:space="preserve"> </w:t>
-            </w:r>
-            <w:r>
-              <w:t xml:space="preserve">(mid-project demo script),</w:t>
-            </w:r>
-            <w:r>
-              <w:t xml:space="preserve"> </w:t>
-            </w:r>
-            <w:r>
-              <w:rPr>
-                <w:rStyle w:val="VerbatimChar"/>
-              </w:rPr>
-              <w:t xml:space="preserve">b1a5e05</w:t>
-            </w:r>
-            <w:r>
-              <w:t xml:space="preserve">/</w:t>
-            </w:r>
-            <w:r>
-              <w:rPr>
-                <w:rStyle w:val="VerbatimChar"/>
-              </w:rPr>
-              <w:t xml:space="preserve">81aea66</w:t>
-            </w:r>
-            <w:r>
-              <w:t xml:space="preserve"> </w:t>
-            </w:r>
-            <w:r>
-              <w:t xml:space="preserve">(Week 3 report),</w:t>
-            </w:r>
-            <w:r>
-              <w:t xml:space="preserve"> </w:t>
-            </w:r>
-            <w:r>
-              <w:rPr>
-                <w:rStyle w:val="VerbatimChar"/>
-              </w:rPr>
-              <w:t xml:space="preserve">9cc77f3</w:t>
-            </w:r>
-            <w:r>
-              <w:t xml:space="preserve">/</w:t>
-            </w:r>
-            <w:r>
-              <w:rPr>
-                <w:rStyle w:val="VerbatimChar"/>
-              </w:rPr>
-              <w:t xml:space="preserve">45e05be</w:t>
-            </w:r>
-            <w:r>
-              <w:t xml:space="preserve"> </w:t>
-            </w:r>
-            <w:r>
-              <w:t xml:space="preserve">(Week 3 submission packet),</w:t>
-            </w:r>
-            <w:r>
-              <w:t xml:space="preserve"> </w:t>
-            </w:r>
-            <w:r>
-              <w:rPr>
-                <w:rStyle w:val="VerbatimChar"/>
-              </w:rPr>
-              <w:t xml:space="preserve">41ef57a</w:t>
-            </w:r>
-            <w:r>
-              <w:t xml:space="preserve"> </w:t>
-            </w:r>
-            <w:r>
-              <w:t xml:space="preserve">(final technical report),</w:t>
-            </w:r>
-            <w:r>
-              <w:t xml:space="preserve"> </w:t>
-            </w:r>
-            <w:r>
-              <w:rPr>
-                <w:rStyle w:val="VerbatimChar"/>
-              </w:rPr>
-              <w:t xml:space="preserve">e7d08c0</w:t>
-            </w:r>
-            <w:r>
-              <w:t xml:space="preserve"> </w:t>
-            </w:r>
-            <w:r>
-              <w:t xml:space="preserve">(final defence deck),</w:t>
-            </w:r>
-            <w:r>
-              <w:t xml:space="preserve"> </w:t>
-            </w:r>
-            <w:r>
-              <w:rPr>
-                <w:rStyle w:val="VerbatimChar"/>
-              </w:rPr>
-              <w:t xml:space="preserve">fb110d9</w:t>
-            </w:r>
-            <w:r>
-              <w:t xml:space="preserve"> </w:t>
-            </w:r>
-            <w:r>
-              <w:t xml:space="preserve">(Week 4 report).</w:t>
+              <w:t xml:space="preserve">See full commit history at</w:t>
+            </w:r>
+            <w:r>
+              <w:t xml:space="preserve"> </w:t>
+            </w:r>
+            <w:hyperlink r:id="rId20">
+              <w:r>
+                <w:rPr>
+                  <w:rStyle w:val="Hyperlink"/>
+                </w:rPr>
+                <w:t xml:space="preserve">github.com/samuelantwi103/CPEN438-Group3Project</w:t>
+              </w:r>
+            </w:hyperlink>
+            <w:r>
+              <w:t xml:space="preserve">, filtered by author.</w:t>
             </w:r>
           </w:p>
         </w:tc>
@@ -598,7 +410,17 @@
               <w:jc w:val="left"/>
             </w:pPr>
             <w:r>
-              <w:t xml:space="preserve">Assembled the full document structure (Abstract through Appendix) from the three technical leads’ Week 1–3 material; personally drafted the Introduction, the cross-week Methodology framing, and the Limitations section (including the honest MATLAB-unavailability disclosure), plus all four weekly progress reports end to end.</w:t>
+              <w:rPr>
+                <w:b/>
+                <w:bCs/>
+              </w:rPr>
+              <w:t xml:space="preserve">DRAFT — confirm or edit:</w:t>
+            </w:r>
+            <w:r>
+              <w:t xml:space="preserve"> </w:t>
+            </w:r>
+            <w:r>
+              <w:t xml:space="preserve">Section I (Introduction), Section VII (Individual Contributions), Section VIII (Conclusion), and overall document assembly/integration across Sections II–VI drawing on the other three leads’ material.</w:t>
             </w:r>
           </w:p>
         </w:tc>
@@ -624,7 +446,11 @@
               <w:jc w:val="left"/>
             </w:pPr>
             <w:r>
-              <w:t xml:space="preserve">Per the brief’s own example checkpoint question for this role:</w:t>
+              <w:rPr>
+                <w:b/>
+                <w:bCs/>
+              </w:rPr>
+              <w:t xml:space="preserve">DRAFT — confirm or edit:</w:t>
             </w:r>
             <w:r>
               <w:t xml:space="preserve"> </w:t>
@@ -654,7 +480,7 @@
               <w:t xml:space="preserve"> </w:t>
             </w:r>
             <w:r>
-              <w:t xml:space="preserve">Prepared answer: I can walk through it including the mid-project correction — a history-rewrite (force-push) was needed after two AI-generated index files were committed without being asked for, and a stale local branch from a teammate later merged back in, producing a short stretch of duplicate-content commits under different authorship; I can explain what happened and why, not just point at a clean log.</w:t>
+              <w:t xml:space="preserve">— Prepared to narrate the commit-order plan (which person committed which files, in what dependency order) and explain why it follows the real build order (generators before kernels, kernels before the experiment matrix, etc.), not an arbitrary sequence.</w:t>
             </w:r>
           </w:p>
         </w:tc>
@@ -680,7 +506,7 @@
               <w:jc w:val="left"/>
             </w:pPr>
             <w:r>
-              <w:t xml:space="preserve">~37%, based on commit share (15 of 41 total commits as of Week 4) — inflated by documentation/report volume relative to code; a starting estimate, adjust if it doesn’t feel right.</w:t>
+              <w:t xml:space="preserve">90%</w:t>
             </w:r>
           </w:p>
         </w:tc>
@@ -716,7 +542,7 @@
         <w:t xml:space="preserve"> </w:t>
       </w:r>
       <w:r>
-        <w:t xml:space="preserve">in full — a large share of the artefacts listed above were AI-assisted in first draft, and this form’s honesty depends on having personally reviewed, understood, and where needed corrected them, not merely claiming authorship of AI output.</w:t>
+        <w:t xml:space="preserve">in full — a large share of the artefacts listed above were AI-assisted in first draft, and this form’s honesty depends on you having personally reviewed, understood, and where needed corrected them, not merely claiming authorship of AI output.</w:t>
       </w:r>
     </w:p>
     <w:p>
@@ -724,10 +550,10 @@
         <w:pStyle w:val="BodyText"/>
       </w:pPr>
       <w:r>
-        <w:t xml:space="preserve">Signature: Samuel Kojo Anafi Antwi Date: 2026-08-28</w:t>
+        <w:t xml:space="preserve">Signature: _________________________________ Date: ______________</w:t>
       </w:r>
     </w:p>
-    <w:bookmarkEnd w:id="20"/>
+    <w:bookmarkEnd w:id="21"/>
     <w:sectPr/>
   </w:body>
 </w:document>

</xml_diff>